<commit_message>
docs: add GitHub repository link to proposal
</commit_message>
<xml_diff>
--- a/docs/competition/MoonLogLens项目申报书.docx
+++ b/docs/competition/MoonLogLens项目申报书.docx
@@ -94,7 +94,7 @@
           </w:tcPr>
           <w:p>
             <w:r>
-              <w:t>仓库链接</w:t>
+              <w:t>GitLink 仓库</w:t>
             </w:r>
           </w:p>
         </w:tc>
@@ -105,6 +105,28 @@
           <w:p>
             <w:r>
               <w:t>https://gitlink.org.cn/python123/moonloglens</w:t>
+            </w:r>
+          </w:p>
+        </w:tc>
+      </w:tr>
+      <w:tr>
+        <w:tc>
+          <w:tcPr>
+            <w:tcW w:type="dxa" w:w="4320"/>
+          </w:tcPr>
+          <w:p>
+            <w:r>
+              <w:t>GitHub 仓库</w:t>
+            </w:r>
+          </w:p>
+        </w:tc>
+        <w:tc>
+          <w:tcPr>
+            <w:tcW w:type="dxa" w:w="4320"/>
+          </w:tcPr>
+          <w:p>
+            <w:r>
+              <w:t>https://github.com/px830/moonloglens</w:t>
             </w:r>
           </w:p>
         </w:tc>
@@ -185,7 +207,7 @@
     </w:p>
     <w:p>
       <w:r>
-        <w:t>项目预期交付一个可运行的 MoonBit 结构化日志处理基础库，覆盖解析、查询、过滤和聚合场景的测试集，清晰的 README 与项目申报材料，以及可在 GitLink 上复现的完整开源仓库。后续可继续扩展真实日志文件读取、流式采集、倒排索引、更多查询组合和可视化分析能力。</w:t>
+        <w:t>项目预期交付一个可运行的 MoonBit 结构化日志处理基础库，覆盖解析、查询、过滤和聚合场景的测试集，清晰的 README 与项目申报材料，以及可在 GitLink 与 GitHub 上核验的完整开源仓库。后续可继续扩展真实日志文件读取、流式采集、倒排索引、更多查询组合和可视化分析能力。</w:t>
       </w:r>
     </w:p>
     <w:sectPr>

</xml_diff>